<commit_message>
Rerun the backtest after the audit fixes: IR -0.25, still no edge
First run that actually includes the statistics component (it was silently
dropped by the bench_close/benchmark_close TypeError) and the corrected
spectral phase labels.

  518 ticker-months, 14 names, 2023-08 -> 2026-08
  IR -0.25 | mean IC -0.025 (t = -0.44) | pooled IC -0.032
  long hit 56%, short hit 49%, quintiles non-monotonic

The window rolls forward with new data, so this is not strictly
like-for-like with the -0.38 run, but the conclusion is unchanged: no
measurable edge on this universe. Docs and the .docx now quote -0.25 and
say plainly that earlier numbers predate the fixes.

Co-Authored-By: Claude Opus 5 <noreply@anthropic.com>
</commit_message>
<xml_diff>
--- a/FUNDING_PROPOSAL.docx
+++ b/FUNDING_PROPOSAL.docx
@@ -93,7 +93,7 @@
         <w:jc w:val="both"/>
       </w:pPr>
       <w:r>
-        <w:t>QuantAnalyzer is a working, institutional-style equity research platform I have built independently over the past several months as a Fox Fund member. A user enters a ticker and receives a multi-paradigm quantitative diagnostic — hidden-Markov regime classification, spectral cycle decomposition, topological persistence, manifold learning, GARCH-based stress framework, peer relative-value, sentiment, and a unified Quant Score — followed by a DCF triangulation, catalyst calendar, written long/short thesis, anticipated PM Q&amp;A, a sell-side-style research note, and a pitch-deck PDF. Every quantitative output is paired with a plain-English explanation.</w:t>
+        <w:t>QuantAnalyzer is a working, institutional-style equity research platform I have built independently over the past several months as a Fox Fund member. A user enters a ticker and receives a multi-paradigm quantitative diagnostic — hidden-Markov regime classification, spectral cycle decomposition, topological persistence, manifold learning, beta-scaled stress scenarios, peer relative-value, sentiment, and a unified Quant Score — followed by a DCF triangulation, catalyst calendar, written long/short thesis, anticipated PM Q&amp;A, a sell-side-style research note, and a pitch-deck PDF. Every quantitative output is paired with a plain-English explanation.</w:t>
       </w:r>
     </w:p>
     <w:p>
@@ -110,7 +110,7 @@
         <w:t>no predictive edge</w:t>
       </w:r>
       <w:r>
-        <w:t xml:space="preserve"> — annualized information ratio ≈ −0.38, mean cross-sectional IC ≈ −0.03 (t = −0.66), statistically indistinguishable from zero. An earlier three-ticker pilot had shown IR ≈ +0.33; the swing between the two runs is itself the finding — on a small, single-sector, survivorship-biased universe the statistic is dominated by sampling noise, so </w:t>
+        <w:t xml:space="preserve"> — annualized information ratio ≈ −0.25, mean cross-sectional IC ≈ −0.025 (t = −0.44), statistically indistinguishable from zero. An earlier three-ticker pilot had shown IR ≈ +0.33; the swing between the two runs is itself the finding — on a small, single-sector, survivorship-biased universe the statistic is dominated by sampling noise, so </w:t>
       </w:r>
       <w:r>
         <w:rPr>
@@ -516,7 +516,7 @@
           <w:p>
             <w:r/>
             <w:r>
-              <w:t>Historical + parametric VaR, GARCH vol forecast, fan chart</w:t>
+              <w:t>Historical + Student-t parametric VaR/CVaR, beta-scaled stress scenarios</w:t>
             </w:r>
           </w:p>
         </w:tc>
@@ -696,7 +696,7 @@
         <w:rPr>
           <w:b/>
         </w:rPr>
-        <w:t>−0.38</w:t>
+        <w:t>−0.25</w:t>
       </w:r>
     </w:p>
     <w:p>
@@ -710,10 +710,10 @@
         <w:rPr>
           <w:b/>
         </w:rPr>
-        <w:t>−0.034</w:t>
+        <w:t>−0.025</w:t>
       </w:r>
       <w:r>
-        <w:t xml:space="preserve"> (t = −0.66 — indistinguishable from zero)</w:t>
+        <w:t xml:space="preserve"> (t = −0.44 — indistinguishable from zero)</w:t>
       </w:r>
     </w:p>
     <w:p>
@@ -727,10 +727,10 @@
         <w:rPr>
           <w:b/>
         </w:rPr>
-        <w:t>+0.010</w:t>
+        <w:t>−0.032</w:t>
       </w:r>
       <w:r>
-        <w:t>; long hit rate 56%, short hit rate 46%</w:t>
+        <w:t>; long hit rate 56%, short hit rate 49%</w:t>
       </w:r>
     </w:p>
     <w:p>
@@ -738,13 +738,13 @@
         <w:pStyle w:val="ListBullet"/>
       </w:pPr>
       <w:r>
-        <w:t xml:space="preserve">Quintile forward returns are non-monotonic and inverted at the extremes: the lowest-scored quintile returned </w:t>
+        <w:t xml:space="preserve">Quintile forward returns are non-monotonic: the lowest-scored quintile returned </w:t>
       </w:r>
       <w:r>
         <w:rPr>
           <w:b/>
         </w:rPr>
-        <w:t>+3.19%</w:t>
+        <w:t>+2.78%</w:t>
       </w:r>
       <w:r>
         <w:t xml:space="preserve"> per period vs </w:t>
@@ -753,10 +753,10 @@
         <w:rPr>
           <w:b/>
         </w:rPr>
-        <w:t>+0.88%</w:t>
+        <w:t>+2.55%</w:t>
       </w:r>
       <w:r>
-        <w:t xml:space="preserve"> for the highest-scored</w:t>
+        <w:t xml:space="preserve"> for the highest-scored, with the fourth quintile worst at +0.44%</w:t>
       </w:r>
     </w:p>
     <w:p>
@@ -770,7 +770,7 @@
         <w:t>The score, as currently weighted, shows no predictive edge on this universe — and I present that openly rather than quoting the earlier three-ticker pilot (IR ≈ +0.33), which the full run contradicts.</w:t>
       </w:r>
       <w:r>
-        <w:t xml:space="preserve"> The instability between the two runs demonstrates the core statistical problem: fourteen highly-correlated mega-cap survivors are effectively one factor bet, so the true sample is closer to 37 months than 518 observations, and any IC estimate is noise-dominated. A companion per-ticker timing test tells the same story — the signal-timed strategy trails SPY on 11 of 14 names (mean alpha ≈ −22%).</w:t>
+        <w:t xml:space="preserve"> These figures are post-audit: a September 2026 review found that the statistics component had been silently dropped from every earlier backtest and that the spectral phase labels were shifted a quarter cycle; both are fixed, and the result did not change materially (IR moved from −0.38 to −0.25). The instability between the two runs demonstrates the core statistical problem: fourteen highly-correlated mega-cap survivors are effectively one factor bet, so the true sample is closer to 37 months than 518 observations, and any IC estimate is noise-dominated. A companion per-ticker timing test tells the same story — the signal-timed strategy trails SPY on 11 of 14 names (mean alpha ≈ −22%).</w:t>
       </w:r>
     </w:p>
     <w:p>
@@ -823,7 +823,7 @@
         <w:jc w:val="both"/>
       </w:pPr>
       <w:r>
-        <w:t xml:space="preserve">QuantAnalyzer is unusual in that every advanced method — HMM regimes, topological persistence, manifold embeddings, GARCH stress, spectral cycles — comes with a plain-English layer written the way a senior quant would explain it to a portfolio manager. A Fox Fund analyst can both </w:t>
+        <w:t xml:space="preserve">QuantAnalyzer is unusual in that every advanced method — HMM regimes, topological persistence, manifold embeddings, tail-risk statistics, spectral cycles — comes with a plain-English layer written the way a senior quant would explain it to a portfolio manager. A Fox Fund analyst can both </w:t>
       </w:r>
       <w:r>
         <w:rPr>

</xml_diff>

<commit_message>
Funding proposal: add the research grounding section and references
Ties each design decision to the paper it came from - why a null backtest
is the expected result on 14 names, why paper trading asks for a thesis,
why the app has no badges or top-movers list, why calibration is the scored
outcome, and where the 0.20 SD target for the literacy study comes from.
Ten references; .docx rebuilt.

Co-Authored-By: Claude Opus 5 <noreply@anthropic.com>
</commit_message>
<xml_diff>
--- a/FUNDING_PROPOSAL.docx
+++ b/FUNDING_PROPOSAL.docx
@@ -1624,7 +1624,411 @@
         <w:pStyle w:val="Heading1"/>
       </w:pPr>
       <w:r>
-        <w:t>6. Project plan — next 90 days</w:t>
+        <w:t>6. Research grounding</w:t>
+      </w:r>
+    </w:p>
+    <w:p>
+      <w:pPr>
+        <w:jc w:val="both"/>
+      </w:pPr>
+      <w:r>
+        <w:t>The project's direction is not improvised: the reframing from "stock-picking platform" to "investor decision lab" follows published findings, and each design choice below cites the work it comes from.</w:t>
+      </w:r>
+    </w:p>
+    <w:p>
+      <w:pPr>
+        <w:jc w:val="both"/>
+      </w:pPr>
+      <w:r>
+        <w:rPr>
+          <w:b/>
+        </w:rPr>
+        <w:t>Why a negative backtest is not a failed project.</w:t>
+      </w:r>
+      <w:r>
+        <w:t xml:space="preserve"> Allen and Karjalainen (1999) found that technical trading rules discovered by genetic search earned no excess return after transaction costs. Gu, Kelly and Xiu (2020), reviewed in </w:t>
+      </w:r>
+      <w:r>
+        <w:rPr>
+          <w:i/>
+        </w:rPr>
+        <w:t>Information Systems Research</w:t>
+      </w:r>
+      <w:r>
+        <w:t>'s FinTech editorial (Hendershott, Zhang, Zhao and Zheng 2021), needed thousands of stocks to separate machine-learning signals from noise. A null result from a 14-name universe is the expected outcome, and the editorial names overfitting and false discovery as the central hazards of this kind of work — which is why the app now keeps a trials ledger and applies a Benjamini-Hochberg correction across components.</w:t>
+      </w:r>
+    </w:p>
+    <w:p>
+      <w:pPr>
+        <w:jc w:val="both"/>
+      </w:pPr>
+      <w:r>
+        <w:rPr>
+          <w:b/>
+        </w:rPr>
+        <w:t>Why friction belongs in the product.</w:t>
+      </w:r>
+      <w:r>
+        <w:t xml:space="preserve"> Liu, Mithas, Pan and Hsieh (</w:t>
+      </w:r>
+      <w:r>
+        <w:rPr>
+          <w:i/>
+        </w:rPr>
+        <w:t>ISR</w:t>
+      </w:r>
+      <w:r>
+        <w:t xml:space="preserve"> 2025) studied 20,665 investors at a Chinese brokerage and found that adopting a mobile trading app had no net effect on performance: transaction friction fell, but trend-chasing rose. Kalda, Loos, Previtero and Hackethal, using 225,000+ German investors, found smartphone trades were markedly more likely to chase recent winners and losers, with lower Sharpe ratios. QuantAnalyzer therefore asks for a thesis, an exit rule, and a source before any paper trade fills, and measures each user's trend-chasing with the same definition those papers use.</w:t>
+      </w:r>
+    </w:p>
+    <w:p>
+      <w:pPr>
+        <w:jc w:val="both"/>
+      </w:pPr>
+      <w:r>
+        <w:rPr>
+          <w:b/>
+        </w:rPr>
+        <w:t>Why the app is not gamified.</w:t>
+      </w:r>
+      <w:r>
+        <w:t xml:space="preserve"> Chapkovski, Khapko and Zoican (</w:t>
+      </w:r>
+      <w:r>
+        <w:rPr>
+          <w:i/>
+        </w:rPr>
+        <w:t>Management Science</w:t>
+      </w:r>
+      <w:r>
+        <w:t>) ran a randomized experiment in which badges and confetti raised trading volume, with the largest effect on novices, and found that people with lower financial literacy self-selected into the gamified platform. Barber, Huang, Odean and Schwarz (</w:t>
+      </w:r>
+      <w:r>
+        <w:rPr>
+          <w:i/>
+        </w:rPr>
+        <w:t>Journal of Finance</w:t>
+      </w:r>
+      <w:r>
+        <w:t xml:space="preserve"> 2022) showed that stocks most heavily bought by Robinhood users went on to underperform. QuantAnalyzer deliberately has no badges, streaks, or "top movers" list.</w:t>
+      </w:r>
+    </w:p>
+    <w:p>
+      <w:pPr>
+        <w:jc w:val="both"/>
+      </w:pPr>
+      <w:r>
+        <w:rPr>
+          <w:b/>
+        </w:rPr>
+        <w:t>Why calibration is the scored outcome.</w:t>
+      </w:r>
+      <w:r>
+        <w:t xml:space="preserve"> Mellers et al. (</w:t>
+      </w:r>
+      <w:r>
+        <w:rPr>
+          <w:i/>
+        </w:rPr>
+        <w:t>Psychological Science</w:t>
+      </w:r>
+      <w:r>
+        <w:t xml:space="preserve"> 2014) found in a multi-year forecasting tournament that a 45-minute probability-training module improved accuracy for two subsequent 8-10 month periods. The Replay Game scores stated confidence against realized hit rates for exactly this reason. (A 2025 re-analysis in the same journal questions how robust those training effects are; the planned experiment is designed to test it here rather than assume it.)</w:t>
+      </w:r>
+    </w:p>
+    <w:p>
+      <w:pPr>
+        <w:jc w:val="both"/>
+      </w:pPr>
+      <w:r>
+        <w:rPr>
+          <w:b/>
+        </w:rPr>
+        <w:t>What the funded work would test.</w:t>
+      </w:r>
+      <w:r>
+        <w:t xml:space="preserve"> Kaiser, Lusardi, Menkhoff and Urban (</w:t>
+      </w:r>
+      <w:r>
+        <w:rPr>
+          <w:i/>
+        </w:rPr>
+        <w:t>Journal of Financial Economics</w:t>
+      </w:r>
+      <w:r>
+        <w:t xml:space="preserve"> 2022), pooling 76 randomized experiments and over 160,000 participants, found financial education raises knowledge by about 0.20 standard deviations after roughly 12 hours of instruction. That figure sets both the realistic target and the sample size for the planned waitlist study of whether this app improves financial literacy.</w:t>
+      </w:r>
+    </w:p>
+    <w:p>
+      <w:pPr>
+        <w:jc w:val="both"/>
+      </w:pPr>
+      <w:r>
+        <w:rPr>
+          <w:b/>
+        </w:rPr>
+        <w:t>References</w:t>
+      </w:r>
+    </w:p>
+    <w:p>
+      <w:pPr>
+        <w:pStyle w:val="ListNumber"/>
+      </w:pPr>
+      <w:r>
+        <w:t>Allen, F., &amp; Karjalainen, R. (1999). Using genetic algorithms to find technical trading rules.</w:t>
+      </w:r>
+    </w:p>
+    <w:p>
+      <w:pPr>
+        <w:jc w:val="both"/>
+      </w:pPr>
+      <w:r>
+        <w:t xml:space="preserve">   </w:t>
+      </w:r>
+      <w:r>
+        <w:rPr>
+          <w:i/>
+        </w:rPr>
+        <w:t>Journal of Financial Economics</w:t>
+      </w:r>
+      <w:r>
+        <w:t>, 51(2), 245-271.</w:t>
+      </w:r>
+    </w:p>
+    <w:p>
+      <w:pPr>
+        <w:pStyle w:val="ListNumber"/>
+      </w:pPr>
+      <w:r>
+        <w:t>Barber, B., Huang, X., Odean, T., &amp; Schwarz, C. (2022). Attention-induced trading and returns:</w:t>
+      </w:r>
+    </w:p>
+    <w:p>
+      <w:pPr>
+        <w:jc w:val="both"/>
+      </w:pPr>
+      <w:r>
+        <w:t xml:space="preserve">   evidence from Robinhood users. </w:t>
+      </w:r>
+      <w:r>
+        <w:rPr>
+          <w:i/>
+        </w:rPr>
+        <w:t>Journal of Finance</w:t>
+      </w:r>
+      <w:r>
+        <w:t>, 77(6), 3141-3190.</w:t>
+      </w:r>
+    </w:p>
+    <w:p>
+      <w:pPr>
+        <w:pStyle w:val="ListNumber"/>
+      </w:pPr>
+      <w:r>
+        <w:t>Chapkovski, P., Khapko, M., &amp; Zoican, M. Trading gamification and investor behavior.</w:t>
+      </w:r>
+    </w:p>
+    <w:p>
+      <w:pPr>
+        <w:jc w:val="both"/>
+      </w:pPr>
+      <w:r>
+        <w:t xml:space="preserve">   </w:t>
+      </w:r>
+      <w:r>
+        <w:rPr>
+          <w:i/>
+        </w:rPr>
+        <w:t>Management Science</w:t>
+      </w:r>
+      <w:r>
+        <w:t>, 72(1), 32-56.</w:t>
+      </w:r>
+    </w:p>
+    <w:p>
+      <w:pPr>
+        <w:pStyle w:val="ListNumber"/>
+      </w:pPr>
+      <w:r>
+        <w:t>Gu, S., Kelly, B., &amp; Xiu, D. (2020). Empirical asset pricing via machine learning.</w:t>
+      </w:r>
+    </w:p>
+    <w:p>
+      <w:pPr>
+        <w:jc w:val="both"/>
+      </w:pPr>
+      <w:r>
+        <w:t xml:space="preserve">   </w:t>
+      </w:r>
+      <w:r>
+        <w:rPr>
+          <w:i/>
+        </w:rPr>
+        <w:t>Review of Financial Studies</w:t>
+      </w:r>
+      <w:r>
+        <w:t>, 33(5), 2223-2273.</w:t>
+      </w:r>
+    </w:p>
+    <w:p>
+      <w:pPr>
+        <w:pStyle w:val="ListNumber"/>
+      </w:pPr>
+      <w:r>
+        <w:t>Hendershott, T., Zhang, X., Zhao, J. L., &amp; Zheng, Z. (2021). FinTech as a game changer: overview</w:t>
+      </w:r>
+    </w:p>
+    <w:p>
+      <w:pPr>
+        <w:jc w:val="both"/>
+      </w:pPr>
+      <w:r>
+        <w:t xml:space="preserve">   of research frontiers. </w:t>
+      </w:r>
+      <w:r>
+        <w:rPr>
+          <w:i/>
+        </w:rPr>
+        <w:t>Information Systems Research</w:t>
+      </w:r>
+      <w:r>
+        <w:t>, 32(1), 1-17.</w:t>
+      </w:r>
+    </w:p>
+    <w:p>
+      <w:pPr>
+        <w:pStyle w:val="ListNumber"/>
+      </w:pPr>
+      <w:r>
+        <w:t>Kaiser, T., Lusardi, A., Menkhoff, L., &amp; Urban, C. (2022). Financial education affects financial</w:t>
+      </w:r>
+    </w:p>
+    <w:p>
+      <w:pPr>
+        <w:jc w:val="both"/>
+      </w:pPr>
+      <w:r>
+        <w:t xml:space="preserve">   knowledge and downstream behaviors. </w:t>
+      </w:r>
+      <w:r>
+        <w:rPr>
+          <w:i/>
+        </w:rPr>
+        <w:t>Journal of Financial Economics</w:t>
+      </w:r>
+      <w:r>
+        <w:t>, 145(2), 255-272.</w:t>
+      </w:r>
+    </w:p>
+    <w:p>
+      <w:pPr>
+        <w:pStyle w:val="ListNumber"/>
+      </w:pPr>
+      <w:r>
+        <w:t>Kalda, A., Loos, B., Previtero, A., &amp; Hackethal, A. Smart(phone) investing? A within</w:t>
+      </w:r>
+    </w:p>
+    <w:p>
+      <w:pPr>
+        <w:jc w:val="both"/>
+      </w:pPr>
+      <w:r>
+        <w:t xml:space="preserve">   investor-time analysis of new technologies and trading behavior. NBER Working Paper 28363.</w:t>
+      </w:r>
+    </w:p>
+    <w:p>
+      <w:pPr>
+        <w:pStyle w:val="ListNumber"/>
+      </w:pPr>
+      <w:r>
+        <w:t>Liu, C.-W., Mithas, S., Pan, Y., &amp; Hsieh, J. J. P.-A. (2025). Mobile apps, trading behaviors, and</w:t>
+      </w:r>
+    </w:p>
+    <w:p>
+      <w:pPr>
+        <w:jc w:val="both"/>
+      </w:pPr>
+      <w:r>
+        <w:t xml:space="preserve">   portfolio performance: evidence from a quasi-experiment in China. </w:t>
+      </w:r>
+      <w:r>
+        <w:rPr>
+          <w:i/>
+        </w:rPr>
+        <w:t>Information Systems    Research</w:t>
+      </w:r>
+      <w:r>
+        <w:t>, 36(2), 828-846.</w:t>
+      </w:r>
+    </w:p>
+    <w:p>
+      <w:pPr>
+        <w:pStyle w:val="ListNumber"/>
+      </w:pPr>
+      <w:r>
+        <w:t>Liu, Y., Li, X., &amp; Zheng, Z. (2024). Smart natural disaster relief: assisting victims with</w:t>
+      </w:r>
+    </w:p>
+    <w:p>
+      <w:pPr>
+        <w:jc w:val="both"/>
+      </w:pPr>
+      <w:r>
+        <w:t xml:space="preserve">   artificial intelligence in lending. </w:t>
+      </w:r>
+      <w:r>
+        <w:rPr>
+          <w:i/>
+        </w:rPr>
+        <w:t>Information Systems Research</w:t>
+      </w:r>
+      <w:r>
+        <w:t>, 35(2), 489-504.</w:t>
+      </w:r>
+    </w:p>
+    <w:p>
+      <w:pPr>
+        <w:pStyle w:val="ListNumber"/>
+      </w:pPr>
+      <w:r>
+        <w:t>Mellers, B., et al. (2014). Psychological strategies for winning a geopolitical forecasting</w:t>
+      </w:r>
+    </w:p>
+    <w:p>
+      <w:pPr>
+        <w:jc w:val="both"/>
+      </w:pPr>
+      <w:r>
+        <w:t xml:space="preserve">    tournament. </w:t>
+      </w:r>
+      <w:r>
+        <w:rPr>
+          <w:i/>
+        </w:rPr>
+        <w:t>Psychological Science</w:t>
+      </w:r>
+      <w:r>
+        <w:t>, 25(5), 1106-1115.</w:t>
+      </w:r>
+    </w:p>
+    <w:p>
+      <w:pPr>
+        <w:spacing w:before="120" w:after="120"/>
+        <w:jc w:val="center"/>
+      </w:pPr>
+      <w:r>
+        <w:rPr>
+          <w:color w:val="BBBBBB"/>
+        </w:rPr>
+        <w:t>——————————————————————————————</w:t>
+      </w:r>
+    </w:p>
+    <w:p>
+      <w:pPr>
+        <w:pStyle w:val="Heading1"/>
+      </w:pPr>
+      <w:r>
+        <w:t>7. Project plan — next 90 days</w:t>
       </w:r>
     </w:p>
     <w:p>
@@ -1742,7 +2146,7 @@
         <w:pStyle w:val="Heading1"/>
       </w:pPr>
       <w:r>
-        <w:t>7. Risks and honest limitations</w:t>
+        <w:t>8. Risks and honest limitations</w:t>
       </w:r>
     </w:p>
     <w:p>
@@ -1840,7 +2244,7 @@
         <w:pStyle w:val="Heading1"/>
       </w:pPr>
       <w:r>
-        <w:t>8. Why support this now</w:t>
+        <w:t>9. Why support this now</w:t>
       </w:r>
     </w:p>
     <w:p>

</xml_diff>